<commit_message>
Update syllabus with new weighting
</commit_message>
<xml_diff>
--- a/math121-syllabus.docx
+++ b/math121-syllabus.docx
@@ -1,6 +1,6 @@
 
 <file path=word/document.xml><?xml version="1.0" encoding="utf-8"?>
-<w:document xmlns:wpc="http://schemas.microsoft.com/office/word/2010/wordprocessingCanvas" xmlns:cx="http://schemas.microsoft.com/office/drawing/2014/chartex" xmlns:cx1="http://schemas.microsoft.com/office/drawing/2015/9/8/chartex" xmlns:cx2="http://schemas.microsoft.com/office/drawing/2015/10/21/chartex" xmlns:cx3="http://schemas.microsoft.com/office/drawing/2016/5/9/chartex" xmlns:cx4="http://schemas.microsoft.com/office/drawing/2016/5/10/chartex" xmlns:cx5="http://schemas.microsoft.com/office/drawing/2016/5/11/chartex" xmlns:cx6="http://schemas.microsoft.com/office/drawing/2016/5/12/chartex" xmlns:cx7="http://schemas.microsoft.com/office/drawing/2016/5/13/chartex" xmlns:cx8="http://schemas.microsoft.com/office/drawing/2016/5/14/chartex" xmlns:mc="http://schemas.openxmlformats.org/markup-compatibility/2006" xmlns:aink="http://schemas.microsoft.com/office/drawing/2016/ink" xmlns:am3d="http://schemas.microsoft.com/office/drawing/2017/model3d" xmlns:o="urn:schemas-microsoft-com:office:office" xmlns:oel="http://schemas.microsoft.com/office/2019/extlst" xmlns:r="http://schemas.openxmlformats.org/officeDocument/2006/relationships" xmlns:m="http://schemas.openxmlformats.org/officeDocument/2006/math" xmlns:v="urn:schemas-microsoft-com:vml" xmlns:wp14="http://schemas.microsoft.com/office/word/2010/wordprocessingDrawing" xmlns:wp="http://schemas.openxmlformats.org/drawingml/2006/wordprocessingDrawing" xmlns:w10="urn:schemas-microsoft-com:office:word" xmlns:w="http://schemas.openxmlformats.org/wordprocessingml/2006/main" xmlns:w14="http://schemas.microsoft.com/office/word/2010/wordml" xmlns:w15="http://schemas.microsoft.com/office/word/2012/wordml" xmlns:w16cei="http://schemas.microsoft.com/office/word/2026/wordml/cei" xmlns:w16cex="http://schemas.microsoft.com/office/word/2018/wordml/cex" xmlns:w16cid="http://schemas.microsoft.com/office/word/2016/wordml/cid" xmlns:w16="http://schemas.microsoft.com/office/word/2018/wordml" xmlns:w16du="http://schemas.microsoft.com/office/word/2023/wordml/word16du" xmlns:w16sdtdh="http://schemas.microsoft.com/office/word/2020/wordml/sdtdatahash" xmlns:w16sdtfl="http://schemas.microsoft.com/office/word/2024/wordml/sdtformatlock" xmlns:w16se="http://schemas.microsoft.com/office/word/2015/wordml/symex" xmlns:wpg="http://schemas.microsoft.com/office/word/2010/wordprocessingGroup" xmlns:wpi="http://schemas.microsoft.com/office/word/2010/wordprocessingInk" xmlns:wne="http://schemas.microsoft.com/office/word/2006/wordml" xmlns:wps="http://schemas.microsoft.com/office/word/2010/wordprocessingShape" mc:Ignorable="w14 w15 w16se w16cid w16 w16cex w16sdtdh w16sdtfl w16du wp14">
+<w:document xmlns:wpc="http://schemas.microsoft.com/office/word/2010/wordprocessingCanvas" xmlns:cx="http://schemas.microsoft.com/office/drawing/2014/chartex" xmlns:cx1="http://schemas.microsoft.com/office/drawing/2015/9/8/chartex" xmlns:cx2="http://schemas.microsoft.com/office/drawing/2015/10/21/chartex" xmlns:cx3="http://schemas.microsoft.com/office/drawing/2016/5/9/chartex" xmlns:cx4="http://schemas.microsoft.com/office/drawing/2016/5/10/chartex" xmlns:cx5="http://schemas.microsoft.com/office/drawing/2016/5/11/chartex" xmlns:cx6="http://schemas.microsoft.com/office/drawing/2016/5/12/chartex" xmlns:cx7="http://schemas.microsoft.com/office/drawing/2016/5/13/chartex" xmlns:cx8="http://schemas.microsoft.com/office/drawing/2016/5/14/chartex" xmlns:mc="http://schemas.openxmlformats.org/markup-compatibility/2006" xmlns:aink="http://schemas.microsoft.com/office/drawing/2016/ink" xmlns:am3d="http://schemas.microsoft.com/office/drawing/2017/model3d" xmlns:o="urn:schemas-microsoft-com:office:office" xmlns:oel="http://schemas.microsoft.com/office/2019/extlst" xmlns:r="http://schemas.openxmlformats.org/officeDocument/2006/relationships" xmlns:m="http://schemas.openxmlformats.org/officeDocument/2006/math" xmlns:v="urn:schemas-microsoft-com:vml" xmlns:wp14="http://schemas.microsoft.com/office/word/2010/wordprocessingDrawing" xmlns:wp="http://schemas.openxmlformats.org/drawingml/2006/wordprocessingDrawing" xmlns:w10="urn:schemas-microsoft-com:office:word" xmlns:w="http://schemas.openxmlformats.org/wordprocessingml/2006/main" xmlns:w14="http://schemas.microsoft.com/office/word/2010/wordml" xmlns:w15="http://schemas.microsoft.com/office/word/2012/wordml" xmlns:w16cex="http://schemas.microsoft.com/office/word/2018/wordml/cex" xmlns:w16cid="http://schemas.microsoft.com/office/word/2016/wordml/cid" xmlns:w16="http://schemas.microsoft.com/office/word/2018/wordml" xmlns:w16du="http://schemas.microsoft.com/office/word/2023/wordml/word16du" xmlns:w16sdtdh="http://schemas.microsoft.com/office/word/2020/wordml/sdtdatahash" xmlns:w16sdtfl="http://schemas.microsoft.com/office/word/2024/wordml/sdtformatlock" xmlns:w16se="http://schemas.microsoft.com/office/word/2015/wordml/symex" xmlns:wpg="http://schemas.microsoft.com/office/word/2010/wordprocessingGroup" xmlns:wpi="http://schemas.microsoft.com/office/word/2010/wordprocessingInk" xmlns:wne="http://schemas.microsoft.com/office/word/2006/wordml" xmlns:wps="http://schemas.microsoft.com/office/word/2010/wordprocessingShape" mc:Ignorable="w14 w15 w16se w16cid w16 w16cex w16sdtdh w16sdtfl w16du wp14">
   <w:body>
     <w:p>
       <w:pPr>
@@ -137,7 +137,35 @@
           <w:sz w:val="20"/>
           <w:szCs w:val="20"/>
         </w:rPr>
-        <w:t>updated 9/3/2026</w:t>
+        <w:t xml:space="preserve">updated </w:t>
+      </w:r>
+      <w:r>
+        <w:rPr>
+          <w:sz w:val="20"/>
+          <w:szCs w:val="20"/>
+        </w:rPr>
+        <w:t>10</w:t>
+      </w:r>
+      <w:r>
+        <w:rPr>
+          <w:sz w:val="20"/>
+          <w:szCs w:val="20"/>
+        </w:rPr>
+        <w:t>/</w:t>
+      </w:r>
+      <w:r>
+        <w:rPr>
+          <w:sz w:val="20"/>
+          <w:szCs w:val="20"/>
+        </w:rPr>
+        <w:t>25</w:t>
+      </w:r>
+      <w:r>
+        <w:rPr>
+          <w:sz w:val="20"/>
+          <w:szCs w:val="20"/>
+        </w:rPr>
+        <w:t>/2026</w:t>
       </w:r>
     </w:p>
     <w:p>
@@ -1048,16 +1076,67 @@
           <w:numId w:val="5"/>
         </w:numPr>
         <w:rPr>
-          <w:sz w:val="22"/>
-          <w:szCs w:val="22"/>
-        </w:rPr>
-      </w:pPr>
-      <w:r>
-        <w:rPr>
-          <w:sz w:val="22"/>
-          <w:szCs w:val="22"/>
-        </w:rPr>
-        <w:t>Final grade will comprise:</w:t>
+          <w:b/>
+          <w:bCs/>
+          <w:sz w:val="22"/>
+          <w:szCs w:val="22"/>
+        </w:rPr>
+      </w:pPr>
+      <w:r>
+        <w:rPr>
+          <w:sz w:val="22"/>
+          <w:szCs w:val="22"/>
+        </w:rPr>
+        <w:t>Final grade will comprise</w:t>
+      </w:r>
+      <w:r>
+        <w:rPr>
+          <w:sz w:val="22"/>
+          <w:szCs w:val="22"/>
+        </w:rPr>
+        <w:t xml:space="preserve"> </w:t>
+      </w:r>
+      <w:r>
+        <w:rPr>
+          <w:color w:val="1F497D" w:themeColor="text2"/>
+          <w:sz w:val="22"/>
+          <w:szCs w:val="22"/>
+        </w:rPr>
+        <w:t>the higher of option A and option B as follows.</w:t>
+      </w:r>
+      <w:r>
+        <w:rPr>
+          <w:sz w:val="22"/>
+          <w:szCs w:val="22"/>
+        </w:rPr>
+        <w:t xml:space="preserve"> </w:t>
+      </w:r>
+      <w:r>
+        <w:rPr>
+          <w:sz w:val="22"/>
+          <w:szCs w:val="22"/>
+        </w:rPr>
+        <w:br/>
+      </w:r>
+      <w:r>
+        <w:rPr>
+          <w:b/>
+          <w:bCs/>
+          <w:color w:val="1F497D" w:themeColor="text2"/>
+          <w:sz w:val="22"/>
+          <w:szCs w:val="22"/>
+        </w:rPr>
+        <w:t>Option A</w:t>
+      </w:r>
+      <w:r>
+        <w:rPr>
+          <w:b/>
+          <w:bCs/>
+          <w:color w:val="1F497D" w:themeColor="text2"/>
+          <w:sz w:val="22"/>
+          <w:szCs w:val="22"/>
+        </w:rPr>
+        <w:t>:</w:t>
       </w:r>
     </w:p>
     <w:tbl>
@@ -1113,6 +1192,13 @@
                 <w:szCs w:val="22"/>
               </w:rPr>
               <w:t>approx.</w:t>
+            </w:r>
+            <w:r>
+              <w:rPr>
+                <w:sz w:val="22"/>
+                <w:szCs w:val="22"/>
+              </w:rPr>
+              <w:t xml:space="preserve"> </w:t>
             </w:r>
             <w:r>
               <w:rPr>
@@ -1301,13 +1387,10 @@
     <w:p>
       <w:pPr>
         <w:pStyle w:val="ListParagraph"/>
-        <w:numPr>
-          <w:ilvl w:val="0"/>
-          <w:numId w:val="5"/>
-        </w:numPr>
         <w:rPr>
           <w:b/>
           <w:bCs/>
+          <w:color w:val="1F497D" w:themeColor="text2"/>
           <w:sz w:val="22"/>
           <w:szCs w:val="22"/>
         </w:rPr>
@@ -1316,187 +1399,244 @@
         <w:rPr>
           <w:b/>
           <w:bCs/>
-          <w:sz w:val="22"/>
-          <w:szCs w:val="22"/>
-        </w:rPr>
-        <w:t xml:space="preserve">Homework assignments: </w:t>
-      </w:r>
-      <w:r>
-        <w:rPr>
-          <w:sz w:val="22"/>
-          <w:szCs w:val="22"/>
-        </w:rPr>
-        <w:t>There will be approximately 10</w:t>
-      </w:r>
-      <w:r>
-        <w:rPr>
-          <w:sz w:val="22"/>
-          <w:szCs w:val="22"/>
-        </w:rPr>
-        <w:t xml:space="preserve"> homework assignments, d</w:t>
-      </w:r>
-      <w:r>
-        <w:rPr>
-          <w:sz w:val="22"/>
-          <w:szCs w:val="22"/>
-        </w:rPr>
-        <w:t xml:space="preserve">ue at the start of class on </w:t>
-      </w:r>
-      <w:r>
-        <w:rPr>
-          <w:sz w:val="22"/>
-          <w:szCs w:val="22"/>
-        </w:rPr>
-        <w:t xml:space="preserve">the dates specified on the class schedule. </w:t>
-      </w:r>
-      <w:r>
-        <w:rPr>
-          <w:sz w:val="22"/>
-          <w:szCs w:val="22"/>
-        </w:rPr>
-        <w:t xml:space="preserve">All homework assignments must be submitted </w:t>
-      </w:r>
-      <w:r>
-        <w:rPr>
-          <w:sz w:val="22"/>
-          <w:szCs w:val="22"/>
-        </w:rPr>
-        <w:t>in hard copy</w:t>
-      </w:r>
-      <w:r>
-        <w:rPr>
-          <w:sz w:val="22"/>
-          <w:szCs w:val="22"/>
-        </w:rPr>
-        <w:t xml:space="preserve">. </w:t>
-      </w:r>
-      <w:r>
-        <w:rPr>
-          <w:sz w:val="22"/>
-          <w:szCs w:val="22"/>
-        </w:rPr>
-        <w:t>H</w:t>
-      </w:r>
-      <w:r>
-        <w:rPr>
-          <w:sz w:val="22"/>
-          <w:szCs w:val="22"/>
-        </w:rPr>
-        <w:t xml:space="preserve">andwritten solutions are acceptable. </w:t>
-      </w:r>
-      <w:r>
-        <w:rPr>
-          <w:sz w:val="22"/>
-          <w:szCs w:val="22"/>
-        </w:rPr>
-        <w:t>Only a random subset of homework questions will be graded</w:t>
-      </w:r>
-      <w:r>
-        <w:rPr>
-          <w:sz w:val="22"/>
-          <w:szCs w:val="22"/>
-        </w:rPr>
-        <w:t xml:space="preserve"> for correctness; the remainder of questions will be graded </w:t>
-      </w:r>
-      <w:r>
-        <w:rPr>
-          <w:sz w:val="22"/>
-          <w:szCs w:val="22"/>
-        </w:rPr>
-        <w:t>on comple</w:t>
-      </w:r>
-      <w:r>
-        <w:rPr>
-          <w:sz w:val="22"/>
-          <w:szCs w:val="22"/>
-        </w:rPr>
-        <w:t>teness only.</w:t>
-      </w:r>
-      <w:r>
-        <w:rPr>
-          <w:sz w:val="22"/>
-          <w:szCs w:val="22"/>
-        </w:rPr>
-        <w:t xml:space="preserve"> </w:t>
-      </w:r>
-      <w:r>
-        <w:rPr>
-          <w:sz w:val="22"/>
-          <w:szCs w:val="22"/>
-        </w:rPr>
-        <w:t>The weighting of homework assignments is not equal</w:t>
-      </w:r>
-      <w:r>
-        <w:rPr>
-          <w:sz w:val="22"/>
-          <w:szCs w:val="22"/>
-        </w:rPr>
-        <w:t>. T</w:t>
-      </w:r>
-      <w:r>
-        <w:rPr>
-          <w:sz w:val="22"/>
-          <w:szCs w:val="22"/>
-        </w:rPr>
-        <w:t>he weight of a homework assignment will be proportional to the total number of points of the questions graded on that assignment</w:t>
-      </w:r>
-      <w:r>
-        <w:rPr>
-          <w:sz w:val="22"/>
-          <w:szCs w:val="22"/>
-        </w:rPr>
-        <w:t>, plus a completeness component</w:t>
-      </w:r>
-      <w:r>
-        <w:rPr>
-          <w:sz w:val="22"/>
-          <w:szCs w:val="22"/>
-        </w:rPr>
-        <w:t>.</w:t>
-      </w:r>
-      <w:r>
-        <w:rPr>
-          <w:sz w:val="22"/>
-          <w:szCs w:val="22"/>
-        </w:rPr>
-        <w:t xml:space="preserve"> </w:t>
-      </w:r>
-      <w:r>
-        <w:rPr>
-          <w:sz w:val="22"/>
-          <w:szCs w:val="22"/>
-        </w:rPr>
-        <w:t xml:space="preserve">In all cases, it is the responsibility of the student to consult the </w:t>
-      </w:r>
-      <w:r>
-        <w:rPr>
-          <w:sz w:val="22"/>
-          <w:szCs w:val="22"/>
-        </w:rPr>
-        <w:t>solutions provided</w:t>
-      </w:r>
-      <w:r>
-        <w:rPr>
-          <w:sz w:val="22"/>
-          <w:szCs w:val="22"/>
-        </w:rPr>
-        <w:t xml:space="preserve"> and understand the correct approach to every question, </w:t>
-      </w:r>
-      <w:proofErr w:type="gramStart"/>
-      <w:r>
-        <w:rPr>
-          <w:sz w:val="22"/>
-          <w:szCs w:val="22"/>
-        </w:rPr>
-        <w:t>whether or not</w:t>
-      </w:r>
-      <w:proofErr w:type="gramEnd"/>
-      <w:r>
-        <w:rPr>
-          <w:sz w:val="22"/>
-          <w:szCs w:val="22"/>
-        </w:rPr>
-        <w:t xml:space="preserve"> it was graded.</w:t>
+          <w:color w:val="1F497D" w:themeColor="text2"/>
+          <w:sz w:val="22"/>
+          <w:szCs w:val="22"/>
+        </w:rPr>
+        <w:t xml:space="preserve">Option B: </w:t>
+      </w:r>
+    </w:p>
+    <w:tbl>
+      <w:tblPr>
+        <w:tblStyle w:val="TableGrid"/>
+        <w:tblW w:w="0" w:type="auto"/>
+        <w:jc w:val="center"/>
+        <w:tblLook w:val="04A0" w:firstRow="1" w:lastRow="0" w:firstColumn="1" w:lastColumn="0" w:noHBand="0" w:noVBand="1"/>
+      </w:tblPr>
+      <w:tblGrid>
+        <w:gridCol w:w="5625"/>
+        <w:gridCol w:w="670"/>
+      </w:tblGrid>
+      <w:tr>
+        <w:trPr>
+          <w:jc w:val="center"/>
+        </w:trPr>
+        <w:tc>
+          <w:tcPr>
+            <w:tcW w:w="5625" w:type="dxa"/>
+          </w:tcPr>
+          <w:p>
+            <w:pPr>
+              <w:rPr>
+                <w:color w:val="1F497D" w:themeColor="text2"/>
+                <w:sz w:val="22"/>
+                <w:szCs w:val="22"/>
+              </w:rPr>
+            </w:pPr>
+            <w:r>
+              <w:rPr>
+                <w:color w:val="1F497D" w:themeColor="text2"/>
+                <w:sz w:val="22"/>
+                <w:szCs w:val="22"/>
+              </w:rPr>
+              <w:t>Homework assignments (about 10 x approx.</w:t>
+            </w:r>
+            <w:r>
+              <w:rPr>
+                <w:color w:val="1F497D" w:themeColor="text2"/>
+                <w:sz w:val="22"/>
+                <w:szCs w:val="22"/>
+              </w:rPr>
+              <w:t xml:space="preserve"> 2</w:t>
+            </w:r>
+            <w:r>
+              <w:rPr>
+                <w:color w:val="1F497D" w:themeColor="text2"/>
+                <w:sz w:val="22"/>
+                <w:szCs w:val="22"/>
+              </w:rPr>
+              <w:t>% each)</w:t>
+            </w:r>
+          </w:p>
+        </w:tc>
+        <w:tc>
+          <w:tcPr>
+            <w:tcW w:w="670" w:type="dxa"/>
+          </w:tcPr>
+          <w:p>
+            <w:pPr>
+              <w:rPr>
+                <w:color w:val="1F497D" w:themeColor="text2"/>
+                <w:sz w:val="22"/>
+                <w:szCs w:val="22"/>
+              </w:rPr>
+            </w:pPr>
+            <w:r>
+              <w:rPr>
+                <w:color w:val="1F497D" w:themeColor="text2"/>
+                <w:sz w:val="22"/>
+                <w:szCs w:val="22"/>
+              </w:rPr>
+              <w:t>2</w:t>
+            </w:r>
+            <w:r>
+              <w:rPr>
+                <w:color w:val="1F497D" w:themeColor="text2"/>
+                <w:sz w:val="22"/>
+                <w:szCs w:val="22"/>
+              </w:rPr>
+              <w:t>0%</w:t>
+            </w:r>
+          </w:p>
+        </w:tc>
+      </w:tr>
+      <w:tr>
+        <w:trPr>
+          <w:jc w:val="center"/>
+        </w:trPr>
+        <w:tc>
+          <w:tcPr>
+            <w:tcW w:w="5625" w:type="dxa"/>
+          </w:tcPr>
+          <w:p>
+            <w:pPr>
+              <w:rPr>
+                <w:color w:val="1F497D" w:themeColor="text2"/>
+                <w:sz w:val="22"/>
+                <w:szCs w:val="22"/>
+              </w:rPr>
+            </w:pPr>
+            <w:r>
+              <w:rPr>
+                <w:color w:val="1F497D" w:themeColor="text2"/>
+                <w:sz w:val="22"/>
+                <w:szCs w:val="22"/>
+              </w:rPr>
+              <w:t xml:space="preserve">Midterm exams (3 x </w:t>
+            </w:r>
+            <w:r>
+              <w:rPr>
+                <w:color w:val="1F497D" w:themeColor="text2"/>
+                <w:sz w:val="22"/>
+                <w:szCs w:val="22"/>
+              </w:rPr>
+              <w:t>18</w:t>
+            </w:r>
+            <w:r>
+              <w:rPr>
+                <w:color w:val="1F497D" w:themeColor="text2"/>
+                <w:sz w:val="22"/>
+                <w:szCs w:val="22"/>
+              </w:rPr>
+              <w:t>% each)</w:t>
+            </w:r>
+          </w:p>
+        </w:tc>
+        <w:tc>
+          <w:tcPr>
+            <w:tcW w:w="670" w:type="dxa"/>
+          </w:tcPr>
+          <w:p>
+            <w:pPr>
+              <w:rPr>
+                <w:color w:val="1F497D" w:themeColor="text2"/>
+                <w:sz w:val="22"/>
+                <w:szCs w:val="22"/>
+              </w:rPr>
+            </w:pPr>
+            <w:r>
+              <w:rPr>
+                <w:color w:val="1F497D" w:themeColor="text2"/>
+                <w:sz w:val="22"/>
+                <w:szCs w:val="22"/>
+              </w:rPr>
+              <w:t>55</w:t>
+            </w:r>
+            <w:r>
+              <w:rPr>
+                <w:color w:val="1F497D" w:themeColor="text2"/>
+                <w:sz w:val="22"/>
+                <w:szCs w:val="22"/>
+              </w:rPr>
+              <w:t>%</w:t>
+            </w:r>
+          </w:p>
+        </w:tc>
+      </w:tr>
+      <w:tr>
+        <w:trPr>
+          <w:jc w:val="center"/>
+        </w:trPr>
+        <w:tc>
+          <w:tcPr>
+            <w:tcW w:w="5625" w:type="dxa"/>
+          </w:tcPr>
+          <w:p>
+            <w:pPr>
+              <w:rPr>
+                <w:color w:val="1F497D" w:themeColor="text2"/>
+                <w:sz w:val="22"/>
+                <w:szCs w:val="22"/>
+              </w:rPr>
+            </w:pPr>
+            <w:r>
+              <w:rPr>
+                <w:color w:val="1F497D" w:themeColor="text2"/>
+                <w:sz w:val="22"/>
+                <w:szCs w:val="22"/>
+              </w:rPr>
+              <w:t>Final exam</w:t>
+            </w:r>
+          </w:p>
+        </w:tc>
+        <w:tc>
+          <w:tcPr>
+            <w:tcW w:w="670" w:type="dxa"/>
+          </w:tcPr>
+          <w:p>
+            <w:pPr>
+              <w:rPr>
+                <w:color w:val="1F497D" w:themeColor="text2"/>
+                <w:sz w:val="22"/>
+                <w:szCs w:val="22"/>
+              </w:rPr>
+            </w:pPr>
+            <w:r>
+              <w:rPr>
+                <w:color w:val="1F497D" w:themeColor="text2"/>
+                <w:sz w:val="22"/>
+                <w:szCs w:val="22"/>
+              </w:rPr>
+              <w:t>25</w:t>
+            </w:r>
+            <w:r>
+              <w:rPr>
+                <w:color w:val="1F497D" w:themeColor="text2"/>
+                <w:sz w:val="22"/>
+                <w:szCs w:val="22"/>
+              </w:rPr>
+              <w:t>%</w:t>
+            </w:r>
+          </w:p>
+        </w:tc>
+      </w:tr>
+    </w:tbl>
+    <w:p>
+      <w:pPr>
+        <w:pStyle w:val="ListParagraph"/>
+        <w:rPr>
+          <w:color w:val="1F497D" w:themeColor="text2"/>
+          <w:sz w:val="22"/>
+          <w:szCs w:val="22"/>
+        </w:rPr>
+      </w:pPr>
+      <w:r>
+        <w:rPr>
+          <w:color w:val="1F497D" w:themeColor="text2"/>
+          <w:sz w:val="22"/>
+          <w:szCs w:val="22"/>
+        </w:rPr>
+        <w:t>[blue text added 10/25/2026]</w:t>
       </w:r>
     </w:p>
     <w:p>
@@ -1507,19 +1647,12 @@
           <w:numId w:val="5"/>
         </w:numPr>
         <w:rPr>
-          <w:sz w:val="22"/>
-          <w:szCs w:val="22"/>
-        </w:rPr>
-      </w:pPr>
-      <w:r>
-        <w:rPr>
           <w:b/>
           <w:bCs/>
           <w:sz w:val="22"/>
           <w:szCs w:val="22"/>
         </w:rPr>
-        <w:t>Midterm exam</w:t>
-      </w:r>
+      </w:pPr>
       <w:r>
         <w:rPr>
           <w:b/>
@@ -1527,30 +1660,98 @@
           <w:sz w:val="22"/>
           <w:szCs w:val="22"/>
         </w:rPr>
-        <w:t>s</w:t>
-      </w:r>
-      <w:r>
-        <w:rPr>
-          <w:b/>
-          <w:bCs/>
-          <w:sz w:val="22"/>
-          <w:szCs w:val="22"/>
-        </w:rPr>
-        <w:t>:</w:t>
-      </w:r>
-      <w:r>
-        <w:rPr>
-          <w:sz w:val="22"/>
-          <w:szCs w:val="22"/>
-        </w:rPr>
-        <w:t xml:space="preserve"> There will be t</w:t>
-      </w:r>
-      <w:r>
-        <w:rPr>
-          <w:sz w:val="22"/>
-          <w:szCs w:val="22"/>
-        </w:rPr>
-        <w:t>hree</w:t>
+        <w:t xml:space="preserve">Homework assignments: </w:t>
+      </w:r>
+      <w:r>
+        <w:rPr>
+          <w:sz w:val="22"/>
+          <w:szCs w:val="22"/>
+        </w:rPr>
+        <w:t>There will be approximately 10</w:t>
+      </w:r>
+      <w:r>
+        <w:rPr>
+          <w:sz w:val="22"/>
+          <w:szCs w:val="22"/>
+        </w:rPr>
+        <w:t xml:space="preserve"> homework assignments, d</w:t>
+      </w:r>
+      <w:r>
+        <w:rPr>
+          <w:sz w:val="22"/>
+          <w:szCs w:val="22"/>
+        </w:rPr>
+        <w:t xml:space="preserve">ue at the start of class on </w:t>
+      </w:r>
+      <w:r>
+        <w:rPr>
+          <w:sz w:val="22"/>
+          <w:szCs w:val="22"/>
+        </w:rPr>
+        <w:t xml:space="preserve">the dates specified on the class schedule. </w:t>
+      </w:r>
+      <w:r>
+        <w:rPr>
+          <w:sz w:val="22"/>
+          <w:szCs w:val="22"/>
+        </w:rPr>
+        <w:t xml:space="preserve">All homework assignments must be submitted </w:t>
+      </w:r>
+      <w:r>
+        <w:rPr>
+          <w:sz w:val="22"/>
+          <w:szCs w:val="22"/>
+        </w:rPr>
+        <w:t>in hard copy</w:t>
+      </w:r>
+      <w:r>
+        <w:rPr>
+          <w:sz w:val="22"/>
+          <w:szCs w:val="22"/>
+        </w:rPr>
+        <w:t xml:space="preserve">. </w:t>
+      </w:r>
+      <w:r>
+        <w:rPr>
+          <w:sz w:val="22"/>
+          <w:szCs w:val="22"/>
+        </w:rPr>
+        <w:t>H</w:t>
+      </w:r>
+      <w:r>
+        <w:rPr>
+          <w:sz w:val="22"/>
+          <w:szCs w:val="22"/>
+        </w:rPr>
+        <w:t xml:space="preserve">andwritten solutions are acceptable. </w:t>
+      </w:r>
+      <w:r>
+        <w:rPr>
+          <w:sz w:val="22"/>
+          <w:szCs w:val="22"/>
+        </w:rPr>
+        <w:t>Only a random subset of homework questions will be graded</w:t>
+      </w:r>
+      <w:r>
+        <w:rPr>
+          <w:sz w:val="22"/>
+          <w:szCs w:val="22"/>
+        </w:rPr>
+        <w:t xml:space="preserve"> for correctness; the remainder of questions will be graded </w:t>
+      </w:r>
+      <w:r>
+        <w:rPr>
+          <w:sz w:val="22"/>
+          <w:szCs w:val="22"/>
+        </w:rPr>
+        <w:t>on comple</w:t>
+      </w:r>
+      <w:r>
+        <w:rPr>
+          <w:sz w:val="22"/>
+          <w:szCs w:val="22"/>
+        </w:rPr>
+        <w:t>teness only.</w:t>
       </w:r>
       <w:r>
         <w:rPr>
@@ -1564,14 +1765,63 @@
           <w:sz w:val="22"/>
           <w:szCs w:val="22"/>
         </w:rPr>
-        <w:t xml:space="preserve">75-minute </w:t>
-      </w:r>
-      <w:r>
-        <w:rPr>
-          <w:sz w:val="22"/>
-          <w:szCs w:val="22"/>
-        </w:rPr>
-        <w:t xml:space="preserve">midterm </w:t>
+        <w:t>The weighting of homework assignments is not equal</w:t>
+      </w:r>
+      <w:r>
+        <w:rPr>
+          <w:sz w:val="22"/>
+          <w:szCs w:val="22"/>
+        </w:rPr>
+        <w:t>. T</w:t>
+      </w:r>
+      <w:r>
+        <w:rPr>
+          <w:sz w:val="22"/>
+          <w:szCs w:val="22"/>
+        </w:rPr>
+        <w:t>he weight of a homework assignment will be proportional to the total number of points of the questions graded on that assignment</w:t>
+      </w:r>
+      <w:r>
+        <w:rPr>
+          <w:sz w:val="22"/>
+          <w:szCs w:val="22"/>
+        </w:rPr>
+        <w:t>, plus a completeness component</w:t>
+      </w:r>
+      <w:r>
+        <w:rPr>
+          <w:sz w:val="22"/>
+          <w:szCs w:val="22"/>
+        </w:rPr>
+        <w:t>.</w:t>
+      </w:r>
+      <w:r>
+        <w:rPr>
+          <w:sz w:val="22"/>
+          <w:szCs w:val="22"/>
+        </w:rPr>
+        <w:t xml:space="preserve"> </w:t>
+      </w:r>
+      <w:r>
+        <w:rPr>
+          <w:sz w:val="22"/>
+          <w:szCs w:val="22"/>
+        </w:rPr>
+        <w:t xml:space="preserve">In all cases, it is the responsibility of the student to consult the </w:t>
+      </w:r>
+      <w:r>
+        <w:rPr>
+          <w:sz w:val="22"/>
+          <w:szCs w:val="22"/>
+        </w:rPr>
+        <w:t>solutions provided</w:t>
+      </w:r>
+      <w:r>
+        <w:rPr>
+          <w:sz w:val="22"/>
+          <w:szCs w:val="22"/>
+        </w:rPr>
+        <w:t xml:space="preserve"> and understand the correct approach to every question, </w:t>
       </w:r>
       <w:proofErr w:type="gramStart"/>
       <w:r>
@@ -1579,14 +1829,7 @@
           <w:sz w:val="22"/>
           <w:szCs w:val="22"/>
         </w:rPr>
-        <w:t>exam</w:t>
-      </w:r>
-      <w:r>
-        <w:rPr>
-          <w:sz w:val="22"/>
-          <w:szCs w:val="22"/>
-        </w:rPr>
-        <w:t>s,</w:t>
+        <w:t>whether or not</w:t>
       </w:r>
       <w:proofErr w:type="gramEnd"/>
       <w:r>
@@ -1594,192 +1837,7 @@
           <w:sz w:val="22"/>
           <w:szCs w:val="22"/>
         </w:rPr>
-        <w:t xml:space="preserve"> </w:t>
-      </w:r>
-      <w:r>
-        <w:rPr>
-          <w:sz w:val="22"/>
-          <w:szCs w:val="22"/>
-        </w:rPr>
-        <w:t xml:space="preserve">taking place </w:t>
-      </w:r>
-      <w:r>
-        <w:rPr>
-          <w:sz w:val="22"/>
-          <w:szCs w:val="22"/>
-        </w:rPr>
-        <w:t xml:space="preserve">in class on </w:t>
-      </w:r>
-      <w:r>
-        <w:rPr>
-          <w:b/>
-          <w:bCs/>
-          <w:color w:val="FF0000"/>
-          <w:sz w:val="22"/>
-          <w:szCs w:val="22"/>
-        </w:rPr>
-        <w:t>T</w:t>
-      </w:r>
-      <w:r>
-        <w:rPr>
-          <w:b/>
-          <w:bCs/>
-          <w:color w:val="FF0000"/>
-          <w:sz w:val="22"/>
-          <w:szCs w:val="22"/>
-        </w:rPr>
-        <w:t>hur</w:t>
-      </w:r>
-      <w:r>
-        <w:rPr>
-          <w:b/>
-          <w:bCs/>
-          <w:color w:val="FF0000"/>
-          <w:sz w:val="22"/>
-          <w:szCs w:val="22"/>
-        </w:rPr>
-        <w:t>s</w:t>
-      </w:r>
-      <w:r>
-        <w:rPr>
-          <w:b/>
-          <w:bCs/>
-          <w:color w:val="FF0000"/>
-          <w:sz w:val="22"/>
-          <w:szCs w:val="22"/>
-        </w:rPr>
-        <w:t xml:space="preserve">day, </w:t>
-      </w:r>
-      <w:r>
-        <w:rPr>
-          <w:b/>
-          <w:bCs/>
-          <w:color w:val="FF0000"/>
-          <w:sz w:val="22"/>
-          <w:szCs w:val="22"/>
-        </w:rPr>
-        <w:t>October 1</w:t>
-      </w:r>
-      <w:r>
-        <w:rPr>
-          <w:sz w:val="22"/>
-          <w:szCs w:val="22"/>
-        </w:rPr>
-        <w:t xml:space="preserve"> and</w:t>
-      </w:r>
-      <w:r>
-        <w:rPr>
-          <w:b/>
-          <w:bCs/>
-          <w:color w:val="FF0000"/>
-          <w:sz w:val="22"/>
-          <w:szCs w:val="22"/>
-        </w:rPr>
-        <w:t xml:space="preserve"> Monday, November 2</w:t>
-      </w:r>
-      <w:r>
-        <w:rPr>
-          <w:color w:val="FF0000"/>
-          <w:sz w:val="22"/>
-          <w:szCs w:val="22"/>
-        </w:rPr>
-        <w:t xml:space="preserve"> </w:t>
-      </w:r>
-      <w:r>
-        <w:rPr>
-          <w:sz w:val="22"/>
-          <w:szCs w:val="22"/>
-        </w:rPr>
-        <w:t xml:space="preserve">and </w:t>
-      </w:r>
-      <w:r>
-        <w:rPr>
-          <w:b/>
-          <w:bCs/>
-          <w:color w:val="FF0000"/>
-          <w:sz w:val="22"/>
-          <w:szCs w:val="22"/>
-        </w:rPr>
-        <w:t>T</w:t>
-      </w:r>
-      <w:r>
-        <w:rPr>
-          <w:b/>
-          <w:bCs/>
-          <w:color w:val="FF0000"/>
-          <w:sz w:val="22"/>
-          <w:szCs w:val="22"/>
-        </w:rPr>
-        <w:t>hur</w:t>
-      </w:r>
-      <w:r>
-        <w:rPr>
-          <w:b/>
-          <w:bCs/>
-          <w:color w:val="FF0000"/>
-          <w:sz w:val="22"/>
-          <w:szCs w:val="22"/>
-        </w:rPr>
-        <w:t xml:space="preserve">sday, </w:t>
-      </w:r>
-      <w:r>
-        <w:rPr>
-          <w:b/>
-          <w:bCs/>
-          <w:color w:val="FF0000"/>
-          <w:sz w:val="22"/>
-          <w:szCs w:val="22"/>
-        </w:rPr>
-        <w:t>December 3</w:t>
-      </w:r>
-      <w:r>
-        <w:rPr>
-          <w:sz w:val="22"/>
-          <w:szCs w:val="22"/>
-        </w:rPr>
-        <w:t>.</w:t>
-      </w:r>
-      <w:r>
-        <w:rPr>
-          <w:sz w:val="22"/>
-          <w:szCs w:val="22"/>
-        </w:rPr>
-        <w:t xml:space="preserve"> </w:t>
-      </w:r>
-      <w:r>
-        <w:rPr>
-          <w:sz w:val="22"/>
-          <w:szCs w:val="22"/>
-        </w:rPr>
-        <w:t>These will be handwritten in-class exams. Exams will be “</w:t>
-      </w:r>
-      <w:r>
-        <w:rPr>
-          <w:sz w:val="22"/>
-          <w:szCs w:val="22"/>
-        </w:rPr>
-        <w:t>closed book with note sheet</w:t>
-      </w:r>
-      <w:r>
-        <w:rPr>
-          <w:sz w:val="22"/>
-          <w:szCs w:val="22"/>
-        </w:rPr>
-        <w:t xml:space="preserve">,” meaning that you </w:t>
-      </w:r>
-      <w:r>
-        <w:rPr>
-          <w:sz w:val="22"/>
-          <w:szCs w:val="22"/>
-        </w:rPr>
-        <w:t>may not consult any materials other than a single page of handwritten notes.</w:t>
-      </w:r>
-      <w:r>
-        <w:rPr>
-          <w:sz w:val="22"/>
-          <w:szCs w:val="22"/>
-        </w:rPr>
-        <w:t xml:space="preserve"> Basic calculators are permitted.</w:t>
+        <w:t xml:space="preserve"> it was graded.</w:t>
       </w:r>
     </w:p>
     <w:p>
@@ -1801,21 +1859,97 @@
           <w:sz w:val="22"/>
           <w:szCs w:val="22"/>
         </w:rPr>
-        <w:t xml:space="preserve">Final exam: </w:t>
-      </w:r>
-      <w:r>
-        <w:rPr>
-          <w:sz w:val="22"/>
-          <w:szCs w:val="22"/>
-        </w:rPr>
-        <w:t xml:space="preserve">The final exam will </w:t>
-      </w:r>
-      <w:r>
-        <w:rPr>
-          <w:sz w:val="22"/>
-          <w:szCs w:val="22"/>
-        </w:rPr>
-        <w:t xml:space="preserve">be on </w:t>
+        <w:t>Midterm exam</w:t>
+      </w:r>
+      <w:r>
+        <w:rPr>
+          <w:b/>
+          <w:bCs/>
+          <w:sz w:val="22"/>
+          <w:szCs w:val="22"/>
+        </w:rPr>
+        <w:t>s</w:t>
+      </w:r>
+      <w:r>
+        <w:rPr>
+          <w:b/>
+          <w:bCs/>
+          <w:sz w:val="22"/>
+          <w:szCs w:val="22"/>
+        </w:rPr>
+        <w:t>:</w:t>
+      </w:r>
+      <w:r>
+        <w:rPr>
+          <w:sz w:val="22"/>
+          <w:szCs w:val="22"/>
+        </w:rPr>
+        <w:t xml:space="preserve"> There will be t</w:t>
+      </w:r>
+      <w:r>
+        <w:rPr>
+          <w:sz w:val="22"/>
+          <w:szCs w:val="22"/>
+        </w:rPr>
+        <w:t>hree</w:t>
+      </w:r>
+      <w:r>
+        <w:rPr>
+          <w:sz w:val="22"/>
+          <w:szCs w:val="22"/>
+        </w:rPr>
+        <w:t xml:space="preserve"> </w:t>
+      </w:r>
+      <w:r>
+        <w:rPr>
+          <w:sz w:val="22"/>
+          <w:szCs w:val="22"/>
+        </w:rPr>
+        <w:t xml:space="preserve">75-minute </w:t>
+      </w:r>
+      <w:r>
+        <w:rPr>
+          <w:sz w:val="22"/>
+          <w:szCs w:val="22"/>
+        </w:rPr>
+        <w:t xml:space="preserve">midterm </w:t>
+      </w:r>
+      <w:proofErr w:type="gramStart"/>
+      <w:r>
+        <w:rPr>
+          <w:sz w:val="22"/>
+          <w:szCs w:val="22"/>
+        </w:rPr>
+        <w:t>exam</w:t>
+      </w:r>
+      <w:r>
+        <w:rPr>
+          <w:sz w:val="22"/>
+          <w:szCs w:val="22"/>
+        </w:rPr>
+        <w:t>s,</w:t>
+      </w:r>
+      <w:proofErr w:type="gramEnd"/>
+      <w:r>
+        <w:rPr>
+          <w:sz w:val="22"/>
+          <w:szCs w:val="22"/>
+        </w:rPr>
+        <w:t xml:space="preserve"> </w:t>
+      </w:r>
+      <w:r>
+        <w:rPr>
+          <w:sz w:val="22"/>
+          <w:szCs w:val="22"/>
+        </w:rPr>
+        <w:t xml:space="preserve">taking place </w:t>
+      </w:r>
+      <w:r>
+        <w:rPr>
+          <w:sz w:val="22"/>
+          <w:szCs w:val="22"/>
+        </w:rPr>
+        <w:t xml:space="preserve">in class on </w:t>
       </w:r>
       <w:r>
         <w:rPr>
@@ -1825,7 +1959,7 @@
           <w:sz w:val="22"/>
           <w:szCs w:val="22"/>
         </w:rPr>
-        <w:t>Fri</w:t>
+        <w:t>T</w:t>
       </w:r>
       <w:r>
         <w:rPr>
@@ -1835,7 +1969,7 @@
           <w:sz w:val="22"/>
           <w:szCs w:val="22"/>
         </w:rPr>
-        <w:t xml:space="preserve">day, </w:t>
+        <w:t>hur</w:t>
       </w:r>
       <w:r>
         <w:rPr>
@@ -1845,7 +1979,7 @@
           <w:sz w:val="22"/>
           <w:szCs w:val="22"/>
         </w:rPr>
-        <w:t>Dec</w:t>
+        <w:t>s</w:t>
       </w:r>
       <w:r>
         <w:rPr>
@@ -1855,7 +1989,7 @@
           <w:sz w:val="22"/>
           <w:szCs w:val="22"/>
         </w:rPr>
-        <w:t>e</w:t>
+        <w:t xml:space="preserve">day, </w:t>
       </w:r>
       <w:r>
         <w:rPr>
@@ -1865,7 +1999,14 @@
           <w:sz w:val="22"/>
           <w:szCs w:val="22"/>
         </w:rPr>
-        <w:t>mber</w:t>
+        <w:t>October 1</w:t>
+      </w:r>
+      <w:r>
+        <w:rPr>
+          <w:sz w:val="22"/>
+          <w:szCs w:val="22"/>
+        </w:rPr>
+        <w:t xml:space="preserve"> and</w:t>
       </w:r>
       <w:r>
         <w:rPr>
@@ -1875,7 +2016,22 @@
           <w:sz w:val="22"/>
           <w:szCs w:val="22"/>
         </w:rPr>
+        <w:t xml:space="preserve"> Monday, November 2</w:t>
+      </w:r>
+      <w:r>
+        <w:rPr>
+          <w:color w:val="FF0000"/>
+          <w:sz w:val="22"/>
+          <w:szCs w:val="22"/>
+        </w:rPr>
         <w:t xml:space="preserve"> </w:t>
+      </w:r>
+      <w:r>
+        <w:rPr>
+          <w:sz w:val="22"/>
+          <w:szCs w:val="22"/>
+        </w:rPr>
+        <w:t xml:space="preserve">and </w:t>
       </w:r>
       <w:r>
         <w:rPr>
@@ -1885,7 +2041,7 @@
           <w:sz w:val="22"/>
           <w:szCs w:val="22"/>
         </w:rPr>
-        <w:t>1</w:t>
+        <w:t>T</w:t>
       </w:r>
       <w:r>
         <w:rPr>
@@ -1895,7 +2051,7 @@
           <w:sz w:val="22"/>
           <w:szCs w:val="22"/>
         </w:rPr>
-        <w:t>8</w:t>
+        <w:t>hur</w:t>
       </w:r>
       <w:r>
         <w:rPr>
@@ -1905,7 +2061,7 @@
           <w:sz w:val="22"/>
           <w:szCs w:val="22"/>
         </w:rPr>
-        <w:t xml:space="preserve"> </w:t>
+        <w:t xml:space="preserve">sday, </w:t>
       </w:r>
       <w:r>
         <w:rPr>
@@ -1915,13 +2071,17 @@
           <w:sz w:val="22"/>
           <w:szCs w:val="22"/>
         </w:rPr>
-        <w:t>from</w:t>
-      </w:r>
-      <w:r>
-        <w:rPr>
-          <w:b/>
-          <w:bCs/>
-          <w:color w:val="FF0000"/>
+        <w:t>December 3</w:t>
+      </w:r>
+      <w:r>
+        <w:rPr>
+          <w:sz w:val="22"/>
+          <w:szCs w:val="22"/>
+        </w:rPr>
+        <w:t>.</w:t>
+      </w:r>
+      <w:r>
+        <w:rPr>
           <w:sz w:val="22"/>
           <w:szCs w:val="22"/>
         </w:rPr>
@@ -1929,120 +2089,38 @@
       </w:r>
       <w:r>
         <w:rPr>
-          <w:b/>
-          <w:bCs/>
-          <w:color w:val="FF0000"/>
-          <w:sz w:val="22"/>
-          <w:szCs w:val="22"/>
-        </w:rPr>
-        <w:t>9a</w:t>
-      </w:r>
-      <w:r>
-        <w:rPr>
-          <w:b/>
-          <w:bCs/>
-          <w:color w:val="FF0000"/>
-          <w:sz w:val="22"/>
-          <w:szCs w:val="22"/>
-        </w:rPr>
-        <w:t>m</w:t>
-      </w:r>
-      <w:r>
-        <w:rPr>
-          <w:b/>
-          <w:bCs/>
-          <w:color w:val="FF0000"/>
-          <w:sz w:val="22"/>
-          <w:szCs w:val="22"/>
-        </w:rPr>
-        <w:t>-</w:t>
-      </w:r>
-      <w:r>
-        <w:rPr>
-          <w:b/>
-          <w:bCs/>
-          <w:color w:val="FF0000"/>
-          <w:sz w:val="22"/>
-          <w:szCs w:val="22"/>
-        </w:rPr>
-        <w:t>12</w:t>
-      </w:r>
-      <w:r>
-        <w:rPr>
-          <w:b/>
-          <w:bCs/>
-          <w:color w:val="FF0000"/>
-          <w:sz w:val="22"/>
-          <w:szCs w:val="22"/>
-        </w:rPr>
-        <w:t>pm</w:t>
-      </w:r>
-      <w:r>
-        <w:rPr>
-          <w:sz w:val="22"/>
-          <w:szCs w:val="22"/>
-        </w:rPr>
-        <w:t>.</w:t>
-      </w:r>
-      <w:r>
-        <w:rPr>
-          <w:sz w:val="22"/>
-          <w:szCs w:val="22"/>
-        </w:rPr>
-        <w:t xml:space="preserve"> </w:t>
-      </w:r>
-      <w:r>
-        <w:rPr>
-          <w:sz w:val="22"/>
-          <w:szCs w:val="22"/>
-        </w:rPr>
-        <w:t>Exam conditions are the same as for the midterm exams</w:t>
-      </w:r>
-      <w:r>
-        <w:rPr>
-          <w:sz w:val="22"/>
-          <w:szCs w:val="22"/>
-        </w:rPr>
-        <w:t xml:space="preserve"> (closed book with </w:t>
-      </w:r>
-      <w:proofErr w:type="gramStart"/>
-      <w:r>
-        <w:rPr>
-          <w:sz w:val="22"/>
-          <w:szCs w:val="22"/>
-        </w:rPr>
-        <w:t>note sheet</w:t>
-      </w:r>
-      <w:proofErr w:type="gramEnd"/>
-      <w:r>
-        <w:rPr>
-          <w:sz w:val="22"/>
-          <w:szCs w:val="22"/>
-        </w:rPr>
-        <w:t xml:space="preserve">), except that </w:t>
-      </w:r>
-      <w:r>
-        <w:rPr>
-          <w:i/>
-          <w:iCs/>
-          <w:sz w:val="22"/>
-          <w:szCs w:val="22"/>
-        </w:rPr>
-        <w:t>two</w:t>
-      </w:r>
-      <w:r>
-        <w:rPr>
-          <w:sz w:val="22"/>
-          <w:szCs w:val="22"/>
-        </w:rPr>
-        <w:t xml:space="preserve"> pages of handwritten notes are permitted</w:t>
-      </w:r>
-      <w:r>
-        <w:rPr>
-          <w:sz w:val="22"/>
-          <w:szCs w:val="22"/>
-        </w:rPr>
-        <w:t>.</w:t>
+          <w:sz w:val="22"/>
+          <w:szCs w:val="22"/>
+        </w:rPr>
+        <w:t>These will be handwritten in-class exams. Exams will be “</w:t>
+      </w:r>
+      <w:r>
+        <w:rPr>
+          <w:sz w:val="22"/>
+          <w:szCs w:val="22"/>
+        </w:rPr>
+        <w:t>closed book with note sheet</w:t>
+      </w:r>
+      <w:r>
+        <w:rPr>
+          <w:sz w:val="22"/>
+          <w:szCs w:val="22"/>
+        </w:rPr>
+        <w:t xml:space="preserve">,” meaning that you </w:t>
+      </w:r>
+      <w:r>
+        <w:rPr>
+          <w:sz w:val="22"/>
+          <w:szCs w:val="22"/>
+        </w:rPr>
+        <w:t>may not consult any materials other than a single page of handwritten notes.</w:t>
+      </w:r>
+      <w:r>
+        <w:rPr>
+          <w:sz w:val="22"/>
+          <w:szCs w:val="22"/>
+        </w:rPr>
+        <w:t xml:space="preserve"> Basic calculators are permitted.</w:t>
       </w:r>
     </w:p>
     <w:p>
@@ -2059,6 +2137,269 @@
       </w:pPr>
       <w:r>
         <w:rPr>
+          <w:b/>
+          <w:bCs/>
+          <w:sz w:val="22"/>
+          <w:szCs w:val="22"/>
+        </w:rPr>
+        <w:t xml:space="preserve">Final exam: </w:t>
+      </w:r>
+      <w:r>
+        <w:rPr>
+          <w:sz w:val="22"/>
+          <w:szCs w:val="22"/>
+        </w:rPr>
+        <w:t xml:space="preserve">The final exam will </w:t>
+      </w:r>
+      <w:r>
+        <w:rPr>
+          <w:sz w:val="22"/>
+          <w:szCs w:val="22"/>
+        </w:rPr>
+        <w:t xml:space="preserve">be on </w:t>
+      </w:r>
+      <w:r>
+        <w:rPr>
+          <w:b/>
+          <w:bCs/>
+          <w:color w:val="FF0000"/>
+          <w:sz w:val="22"/>
+          <w:szCs w:val="22"/>
+        </w:rPr>
+        <w:t>Fri</w:t>
+      </w:r>
+      <w:r>
+        <w:rPr>
+          <w:b/>
+          <w:bCs/>
+          <w:color w:val="FF0000"/>
+          <w:sz w:val="22"/>
+          <w:szCs w:val="22"/>
+        </w:rPr>
+        <w:t xml:space="preserve">day, </w:t>
+      </w:r>
+      <w:r>
+        <w:rPr>
+          <w:b/>
+          <w:bCs/>
+          <w:color w:val="FF0000"/>
+          <w:sz w:val="22"/>
+          <w:szCs w:val="22"/>
+        </w:rPr>
+        <w:t>Dec</w:t>
+      </w:r>
+      <w:r>
+        <w:rPr>
+          <w:b/>
+          <w:bCs/>
+          <w:color w:val="FF0000"/>
+          <w:sz w:val="22"/>
+          <w:szCs w:val="22"/>
+        </w:rPr>
+        <w:t>e</w:t>
+      </w:r>
+      <w:r>
+        <w:rPr>
+          <w:b/>
+          <w:bCs/>
+          <w:color w:val="FF0000"/>
+          <w:sz w:val="22"/>
+          <w:szCs w:val="22"/>
+        </w:rPr>
+        <w:t>mber</w:t>
+      </w:r>
+      <w:r>
+        <w:rPr>
+          <w:b/>
+          <w:bCs/>
+          <w:color w:val="FF0000"/>
+          <w:sz w:val="22"/>
+          <w:szCs w:val="22"/>
+        </w:rPr>
+        <w:t xml:space="preserve"> </w:t>
+      </w:r>
+      <w:r>
+        <w:rPr>
+          <w:b/>
+          <w:bCs/>
+          <w:color w:val="FF0000"/>
+          <w:sz w:val="22"/>
+          <w:szCs w:val="22"/>
+        </w:rPr>
+        <w:t>1</w:t>
+      </w:r>
+      <w:r>
+        <w:rPr>
+          <w:b/>
+          <w:bCs/>
+          <w:color w:val="FF0000"/>
+          <w:sz w:val="22"/>
+          <w:szCs w:val="22"/>
+        </w:rPr>
+        <w:t>8</w:t>
+      </w:r>
+      <w:r>
+        <w:rPr>
+          <w:b/>
+          <w:bCs/>
+          <w:color w:val="FF0000"/>
+          <w:sz w:val="22"/>
+          <w:szCs w:val="22"/>
+        </w:rPr>
+        <w:t xml:space="preserve"> </w:t>
+      </w:r>
+      <w:r>
+        <w:rPr>
+          <w:b/>
+          <w:bCs/>
+          <w:color w:val="FF0000"/>
+          <w:sz w:val="22"/>
+          <w:szCs w:val="22"/>
+        </w:rPr>
+        <w:t>from</w:t>
+      </w:r>
+      <w:r>
+        <w:rPr>
+          <w:b/>
+          <w:bCs/>
+          <w:color w:val="FF0000"/>
+          <w:sz w:val="22"/>
+          <w:szCs w:val="22"/>
+        </w:rPr>
+        <w:t xml:space="preserve"> </w:t>
+      </w:r>
+      <w:r>
+        <w:rPr>
+          <w:b/>
+          <w:bCs/>
+          <w:color w:val="FF0000"/>
+          <w:sz w:val="22"/>
+          <w:szCs w:val="22"/>
+        </w:rPr>
+        <w:t>9a</w:t>
+      </w:r>
+      <w:r>
+        <w:rPr>
+          <w:b/>
+          <w:bCs/>
+          <w:color w:val="FF0000"/>
+          <w:sz w:val="22"/>
+          <w:szCs w:val="22"/>
+        </w:rPr>
+        <w:t>m</w:t>
+      </w:r>
+      <w:r>
+        <w:rPr>
+          <w:b/>
+          <w:bCs/>
+          <w:color w:val="FF0000"/>
+          <w:sz w:val="22"/>
+          <w:szCs w:val="22"/>
+        </w:rPr>
+        <w:t>-</w:t>
+      </w:r>
+      <w:r>
+        <w:rPr>
+          <w:b/>
+          <w:bCs/>
+          <w:color w:val="FF0000"/>
+          <w:sz w:val="22"/>
+          <w:szCs w:val="22"/>
+        </w:rPr>
+        <w:t>12</w:t>
+      </w:r>
+      <w:r>
+        <w:rPr>
+          <w:b/>
+          <w:bCs/>
+          <w:color w:val="FF0000"/>
+          <w:sz w:val="22"/>
+          <w:szCs w:val="22"/>
+        </w:rPr>
+        <w:t>pm</w:t>
+      </w:r>
+      <w:r>
+        <w:rPr>
+          <w:sz w:val="22"/>
+          <w:szCs w:val="22"/>
+        </w:rPr>
+        <w:t>.</w:t>
+      </w:r>
+      <w:r>
+        <w:rPr>
+          <w:sz w:val="22"/>
+          <w:szCs w:val="22"/>
+        </w:rPr>
+        <w:t xml:space="preserve"> </w:t>
+      </w:r>
+      <w:r>
+        <w:rPr>
+          <w:sz w:val="22"/>
+          <w:szCs w:val="22"/>
+        </w:rPr>
+        <w:t>Exam conditions are the same as for the midterm exams</w:t>
+      </w:r>
+      <w:r>
+        <w:rPr>
+          <w:sz w:val="22"/>
+          <w:szCs w:val="22"/>
+        </w:rPr>
+        <w:t xml:space="preserve"> (closed book with </w:t>
+      </w:r>
+      <w:proofErr w:type="gramStart"/>
+      <w:r>
+        <w:rPr>
+          <w:sz w:val="22"/>
+          <w:szCs w:val="22"/>
+        </w:rPr>
+        <w:t>note sheet</w:t>
+      </w:r>
+      <w:proofErr w:type="gramEnd"/>
+      <w:r>
+        <w:rPr>
+          <w:sz w:val="22"/>
+          <w:szCs w:val="22"/>
+        </w:rPr>
+        <w:t xml:space="preserve">), except that </w:t>
+      </w:r>
+      <w:r>
+        <w:rPr>
+          <w:i/>
+          <w:iCs/>
+          <w:sz w:val="22"/>
+          <w:szCs w:val="22"/>
+        </w:rPr>
+        <w:t>two</w:t>
+      </w:r>
+      <w:r>
+        <w:rPr>
+          <w:sz w:val="22"/>
+          <w:szCs w:val="22"/>
+        </w:rPr>
+        <w:t xml:space="preserve"> pages of handwritten notes are permitted</w:t>
+      </w:r>
+      <w:r>
+        <w:rPr>
+          <w:sz w:val="22"/>
+          <w:szCs w:val="22"/>
+        </w:rPr>
+        <w:t>.</w:t>
+      </w:r>
+    </w:p>
+    <w:p>
+      <w:pPr>
+        <w:pStyle w:val="ListParagraph"/>
+        <w:numPr>
+          <w:ilvl w:val="0"/>
+          <w:numId w:val="5"/>
+        </w:numPr>
+        <w:rPr>
+          <w:sz w:val="22"/>
+          <w:szCs w:val="22"/>
+        </w:rPr>
+      </w:pPr>
+      <w:r>
+        <w:rPr>
           <w:sz w:val="22"/>
           <w:szCs w:val="22"/>
         </w:rPr>
@@ -2340,6 +2681,7 @@
           <w:i/>
           <w:iCs/>
         </w:rPr>
+        <w:lastRenderedPageBreak/>
         <w:t>optional</w:t>
       </w:r>
       <w:r>
@@ -2458,7 +2800,6 @@
         <w:pStyle w:val="Heading3"/>
       </w:pPr>
       <w:r>
-        <w:lastRenderedPageBreak/>
         <w:t>Amount of work</w:t>
       </w:r>
     </w:p>
@@ -2984,7 +3325,7 @@
 </file>
 
 <file path=word/numbering.xml><?xml version="1.0" encoding="utf-8"?>
-<w:numbering xmlns:wpc="http://schemas.microsoft.com/office/word/2010/wordprocessingCanvas" xmlns:cx="http://schemas.microsoft.com/office/drawing/2014/chartex" xmlns:cx1="http://schemas.microsoft.com/office/drawing/2015/9/8/chartex" xmlns:cx2="http://schemas.microsoft.com/office/drawing/2015/10/21/chartex" xmlns:cx3="http://schemas.microsoft.com/office/drawing/2016/5/9/chartex" xmlns:cx4="http://schemas.microsoft.com/office/drawing/2016/5/10/chartex" xmlns:cx5="http://schemas.microsoft.com/office/drawing/2016/5/11/chartex" xmlns:cx6="http://schemas.microsoft.com/office/drawing/2016/5/12/chartex" xmlns:cx7="http://schemas.microsoft.com/office/drawing/2016/5/13/chartex" xmlns:cx8="http://schemas.microsoft.com/office/drawing/2016/5/14/chartex" xmlns:mc="http://schemas.openxmlformats.org/markup-compatibility/2006" xmlns:aink="http://schemas.microsoft.com/office/drawing/2016/ink" xmlns:am3d="http://schemas.microsoft.com/office/drawing/2017/model3d" xmlns:o="urn:schemas-microsoft-com:office:office" xmlns:oel="http://schemas.microsoft.com/office/2019/extlst" xmlns:r="http://schemas.openxmlformats.org/officeDocument/2006/relationships" xmlns:m="http://schemas.openxmlformats.org/officeDocument/2006/math" xmlns:v="urn:schemas-microsoft-com:vml" xmlns:wp14="http://schemas.microsoft.com/office/word/2010/wordprocessingDrawing" xmlns:wp="http://schemas.openxmlformats.org/drawingml/2006/wordprocessingDrawing" xmlns:w10="urn:schemas-microsoft-com:office:word" xmlns:w="http://schemas.openxmlformats.org/wordprocessingml/2006/main" xmlns:w14="http://schemas.microsoft.com/office/word/2010/wordml" xmlns:w15="http://schemas.microsoft.com/office/word/2012/wordml" xmlns:w16cei="http://schemas.microsoft.com/office/word/2026/wordml/cei" xmlns:w16cex="http://schemas.microsoft.com/office/word/2018/wordml/cex" xmlns:w16cid="http://schemas.microsoft.com/office/word/2016/wordml/cid" xmlns:w16="http://schemas.microsoft.com/office/word/2018/wordml" xmlns:w16du="http://schemas.microsoft.com/office/word/2023/wordml/word16du" xmlns:w16sdtdh="http://schemas.microsoft.com/office/word/2020/wordml/sdtdatahash" xmlns:w16sdtfl="http://schemas.microsoft.com/office/word/2024/wordml/sdtformatlock" xmlns:w16se="http://schemas.microsoft.com/office/word/2015/wordml/symex" xmlns:wpg="http://schemas.microsoft.com/office/word/2010/wordprocessingGroup" xmlns:wpi="http://schemas.microsoft.com/office/word/2010/wordprocessingInk" xmlns:wne="http://schemas.microsoft.com/office/word/2006/wordml" xmlns:wps="http://schemas.microsoft.com/office/word/2010/wordprocessingShape" mc:Ignorable="w14 w15 w16se w16cid w16 w16cex w16sdtdh w16sdtfl w16du wp14">
+<w:numbering xmlns:wpc="http://schemas.microsoft.com/office/word/2010/wordprocessingCanvas" xmlns:cx="http://schemas.microsoft.com/office/drawing/2014/chartex" xmlns:cx1="http://schemas.microsoft.com/office/drawing/2015/9/8/chartex" xmlns:cx2="http://schemas.microsoft.com/office/drawing/2015/10/21/chartex" xmlns:cx3="http://schemas.microsoft.com/office/drawing/2016/5/9/chartex" xmlns:cx4="http://schemas.microsoft.com/office/drawing/2016/5/10/chartex" xmlns:cx5="http://schemas.microsoft.com/office/drawing/2016/5/11/chartex" xmlns:cx6="http://schemas.microsoft.com/office/drawing/2016/5/12/chartex" xmlns:cx7="http://schemas.microsoft.com/office/drawing/2016/5/13/chartex" xmlns:cx8="http://schemas.microsoft.com/office/drawing/2016/5/14/chartex" xmlns:mc="http://schemas.openxmlformats.org/markup-compatibility/2006" xmlns:aink="http://schemas.microsoft.com/office/drawing/2016/ink" xmlns:am3d="http://schemas.microsoft.com/office/drawing/2017/model3d" xmlns:o="urn:schemas-microsoft-com:office:office" xmlns:oel="http://schemas.microsoft.com/office/2019/extlst" xmlns:r="http://schemas.openxmlformats.org/officeDocument/2006/relationships" xmlns:m="http://schemas.openxmlformats.org/officeDocument/2006/math" xmlns:v="urn:schemas-microsoft-com:vml" xmlns:wp14="http://schemas.microsoft.com/office/word/2010/wordprocessingDrawing" xmlns:wp="http://schemas.openxmlformats.org/drawingml/2006/wordprocessingDrawing" xmlns:w10="urn:schemas-microsoft-com:office:word" xmlns:w="http://schemas.openxmlformats.org/wordprocessingml/2006/main" xmlns:w14="http://schemas.microsoft.com/office/word/2010/wordml" xmlns:w15="http://schemas.microsoft.com/office/word/2012/wordml" xmlns:w16cex="http://schemas.microsoft.com/office/word/2018/wordml/cex" xmlns:w16cid="http://schemas.microsoft.com/office/word/2016/wordml/cid" xmlns:w16="http://schemas.microsoft.com/office/word/2018/wordml" xmlns:w16du="http://schemas.microsoft.com/office/word/2023/wordml/word16du" xmlns:w16sdtdh="http://schemas.microsoft.com/office/word/2020/wordml/sdtdatahash" xmlns:w16sdtfl="http://schemas.microsoft.com/office/word/2024/wordml/sdtformatlock" xmlns:w16se="http://schemas.microsoft.com/office/word/2015/wordml/symex" xmlns:wpg="http://schemas.microsoft.com/office/word/2010/wordprocessingGroup" xmlns:wpi="http://schemas.microsoft.com/office/word/2010/wordprocessingInk" xmlns:wne="http://schemas.microsoft.com/office/word/2006/wordml" xmlns:wps="http://schemas.microsoft.com/office/word/2010/wordprocessingShape" mc:Ignorable="w14 w15 w16se w16cid w16 w16cex w16sdtdh w16sdtfl w16du wp14">
   <w:abstractNum w:abstractNumId="0" w15:restartNumberingAfterBreak="0">
     <w:nsid w:val="04C367A2"/>
     <w:multiLevelType w:val="hybridMultilevel"/>
@@ -5813,7 +6154,7 @@
   <w:style w:type="paragraph" w:default="1" w:styleId="Normal">
     <w:name w:val="Normal"/>
     <w:qFormat/>
-    <w:rsid w:val="0033377F"/>
+    <w:rsid w:val="00AF362D"/>
     <w:rPr>
       <w:rFonts w:ascii="Arial" w:hAnsi="Arial"/>
       <w:sz w:val="24"/>

</xml_diff>